<commit_message>
Day 15 almost done + seat plan completed
</commit_message>
<xml_diff>
--- a/Received/1/1, Nepali.docx
+++ b/Received/1/1, Nepali.docx
@@ -78,6 +78,16 @@
                               </w:rPr>
                               <w:t>D-</w:t>
                             </w:r>
+                            <w:r>
+                              <w:rPr>
+                                <w:rFonts w:ascii="Times New Roman" w:hAnsi="Times New Roman" w:cs="Times New Roman"/>
+                                <w:b/>
+                                <w:bCs/>
+                                <w:sz w:val="32"/>
+                                <w:szCs w:val="32"/>
+                              </w:rPr>
+                              <w:t>16</w:t>
+                            </w:r>
                           </w:p>
                         </w:txbxContent>
                       </wps:txbx>
@@ -115,6 +125,16 @@
                           <w:szCs w:val="32"/>
                         </w:rPr>
                         <w:t>D-</w:t>
+                      </w:r>
+                      <w:r>
+                        <w:rPr>
+                          <w:rFonts w:ascii="Times New Roman" w:hAnsi="Times New Roman" w:cs="Times New Roman"/>
+                          <w:b/>
+                          <w:bCs/>
+                          <w:sz w:val="32"/>
+                          <w:szCs w:val="32"/>
+                        </w:rPr>
+                        <w:t>16</w:t>
                       </w:r>
                     </w:p>
                   </w:txbxContent>
@@ -1182,7 +1202,7 @@
                 </mc:Choice>
                 <mc:Fallback>
                   <w:pict>
-                    <v:rect w14:anchorId="16162F45" id="Rectangle 2" o:spid="_x0000_s1026" style="position:absolute;margin-left:450pt;margin-top:4.95pt;width:81pt;height:36.75pt;z-index:251644416;visibility:visible;mso-wrap-style:square;mso-width-percent:0;mso-height-percent:0;mso-wrap-distance-left:9pt;mso-wrap-distance-top:0;mso-wrap-distance-right:9pt;mso-wrap-distance-bottom:0;mso-position-horizontal:absolute;mso-position-horizontal-relative:text;mso-position-vertical:absolute;mso-position-vertical-relative:text;mso-width-percent:0;mso-height-percent:0;mso-width-relative:page;mso-height-relative:page;v-text-anchor:top" o:gfxdata="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" strokeweight="1.5pt"/>
+                    <v:rect w14:anchorId="31BDC0CC" id="Rectangle 2" o:spid="_x0000_s1026" style="position:absolute;margin-left:450pt;margin-top:4.95pt;width:81pt;height:36.75pt;z-index:251644416;visibility:visible;mso-wrap-style:square;mso-width-percent:0;mso-height-percent:0;mso-wrap-distance-left:9pt;mso-wrap-distance-top:0;mso-wrap-distance-right:9pt;mso-wrap-distance-bottom:0;mso-position-horizontal:absolute;mso-position-horizontal-relative:text;mso-position-vertical:absolute;mso-position-vertical-relative:text;mso-width-percent:0;mso-height-percent:0;mso-width-relative:page;mso-height-relative:page;v-text-anchor:top" o:gfxdata="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" strokeweight="1.5pt"/>
                   </w:pict>
                 </mc:Fallback>
               </mc:AlternateContent>
@@ -7732,7 +7752,7 @@
           <w:noProof/>
         </w:rPr>
         <w:drawing>
-          <wp:anchor distT="0" distB="0" distL="114300" distR="114300" simplePos="0" relativeHeight="251672064" behindDoc="0" locked="0" layoutInCell="1" allowOverlap="1" wp14:anchorId="67D42675" wp14:editId="5226DE21">
+          <wp:anchor distT="0" distB="0" distL="114300" distR="114300" simplePos="0" relativeHeight="251672064" behindDoc="0" locked="0" layoutInCell="1" allowOverlap="1" wp14:anchorId="67D42675" wp14:editId="7EEAB513">
             <wp:simplePos x="0" y="0"/>
             <wp:positionH relativeFrom="column">
               <wp:posOffset>0</wp:posOffset>

</xml_diff>

<commit_message>
D-15 sent for printing
</commit_message>
<xml_diff>
--- a/Received/1/1, Nepali.docx
+++ b/Received/1/1, Nepali.docx
@@ -1202,7 +1202,7 @@
                 </mc:Choice>
                 <mc:Fallback>
                   <w:pict>
-                    <v:rect w14:anchorId="31BDC0CC" id="Rectangle 2" o:spid="_x0000_s1026" style="position:absolute;margin-left:450pt;margin-top:4.95pt;width:81pt;height:36.75pt;z-index:251644416;visibility:visible;mso-wrap-style:square;mso-width-percent:0;mso-height-percent:0;mso-wrap-distance-left:9pt;mso-wrap-distance-top:0;mso-wrap-distance-right:9pt;mso-wrap-distance-bottom:0;mso-position-horizontal:absolute;mso-position-horizontal-relative:text;mso-position-vertical:absolute;mso-position-vertical-relative:text;mso-width-percent:0;mso-height-percent:0;mso-width-relative:page;mso-height-relative:page;v-text-anchor:top" o:gfxdata="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" strokeweight="1.5pt"/>
+                    <v:rect w14:anchorId="54EC3F1E" id="Rectangle 2" o:spid="_x0000_s1026" style="position:absolute;margin-left:450pt;margin-top:4.95pt;width:81pt;height:36.75pt;z-index:251644416;visibility:visible;mso-wrap-style:square;mso-width-percent:0;mso-height-percent:0;mso-wrap-distance-left:9pt;mso-wrap-distance-top:0;mso-wrap-distance-right:9pt;mso-wrap-distance-bottom:0;mso-position-horizontal:absolute;mso-position-horizontal-relative:text;mso-position-vertical:absolute;mso-position-vertical-relative:text;mso-width-percent:0;mso-height-percent:0;mso-width-relative:page;mso-height-relative:page;v-text-anchor:top" o:gfxdata="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" strokeweight="1.5pt"/>
                   </w:pict>
                 </mc:Fallback>
               </mc:AlternateContent>
@@ -1933,7 +1933,23 @@
           <w:sz w:val="36"/>
           <w:szCs w:val="36"/>
         </w:rPr>
-        <w:t>flysf</w:t>
+        <w:t>fy</w:t>
+      </w:r>
+      <w:r>
+        <w:rPr>
+          <w:rFonts w:ascii="Preeti" w:hAnsi="Preeti"/>
+          <w:sz w:val="36"/>
+          <w:szCs w:val="36"/>
+        </w:rPr>
+        <w:t>L</w:t>
+      </w:r>
+      <w:r>
+        <w:rPr>
+          <w:rFonts w:ascii="Preeti" w:hAnsi="Preeti"/>
+          <w:sz w:val="36"/>
+          <w:szCs w:val="36"/>
+        </w:rPr>
+        <w:t>sf</w:t>
       </w:r>
       <w:proofErr w:type="spellEnd"/>
       <w:proofErr w:type="gramEnd"/>
@@ -2594,7 +2610,23 @@
           <w:sz w:val="36"/>
           <w:szCs w:val="36"/>
         </w:rPr>
-        <w:t xml:space="preserve"> kl9\5g\ &lt; </w:t>
+        <w:t xml:space="preserve"> k9\</w:t>
+      </w:r>
+      <w:r>
+        <w:rPr>
+          <w:rFonts w:ascii="Preeti" w:hAnsi="Preeti"/>
+          <w:sz w:val="36"/>
+          <w:szCs w:val="36"/>
+        </w:rPr>
+        <w:t>l</w:t>
+      </w:r>
+      <w:r>
+        <w:rPr>
+          <w:rFonts w:ascii="Preeti" w:hAnsi="Preeti"/>
+          <w:sz w:val="36"/>
+          <w:szCs w:val="36"/>
+        </w:rPr>
+        <w:t xml:space="preserve">5g\ &lt; </w:t>
       </w:r>
     </w:p>
     <w:p>
@@ -2994,7 +3026,23 @@
           <w:sz w:val="36"/>
           <w:szCs w:val="36"/>
         </w:rPr>
-        <w:t>flysf</w:t>
+        <w:t>fy</w:t>
+      </w:r>
+      <w:r>
+        <w:rPr>
+          <w:rFonts w:ascii="Preeti" w:hAnsi="Preeti"/>
+          <w:sz w:val="36"/>
+          <w:szCs w:val="36"/>
+        </w:rPr>
+        <w:t>L</w:t>
+      </w:r>
+      <w:r>
+        <w:rPr>
+          <w:rFonts w:ascii="Preeti" w:hAnsi="Preeti"/>
+          <w:sz w:val="36"/>
+          <w:szCs w:val="36"/>
+        </w:rPr>
+        <w:t>sf</w:t>
       </w:r>
       <w:proofErr w:type="spellEnd"/>
       <w:proofErr w:type="gramEnd"/>
@@ -4533,7 +4581,31 @@
           <w:sz w:val="36"/>
           <w:szCs w:val="36"/>
         </w:rPr>
-        <w:t>agL</w:t>
+        <w:t>a</w:t>
+      </w:r>
+      <w:r>
+        <w:rPr>
+          <w:rFonts w:ascii="Preeti" w:hAnsi="Preeti"/>
+          <w:sz w:val="36"/>
+          <w:szCs w:val="36"/>
+        </w:rPr>
+        <w:t>f</w:t>
+      </w:r>
+      <w:r>
+        <w:rPr>
+          <w:rFonts w:ascii="Preeti" w:hAnsi="Preeti"/>
+          <w:sz w:val="36"/>
+          <w:szCs w:val="36"/>
+        </w:rPr>
+        <w:t>l</w:t>
+      </w:r>
+      <w:r>
+        <w:rPr>
+          <w:rFonts w:ascii="Preeti" w:hAnsi="Preeti"/>
+          <w:sz w:val="36"/>
+          <w:szCs w:val="36"/>
+        </w:rPr>
+        <w:t>g</w:t>
       </w:r>
       <w:proofErr w:type="spellEnd"/>
       <w:r>
@@ -4609,18 +4681,16 @@
           <w:sz w:val="36"/>
           <w:szCs w:val="36"/>
         </w:rPr>
-        <w:t xml:space="preserve">v_ </w:t>
-      </w:r>
-      <w:proofErr w:type="spellStart"/>
-      <w:r>
-        <w:rPr>
-          <w:rFonts w:ascii="Preeti" w:hAnsi="Preeti"/>
-          <w:sz w:val="36"/>
-          <w:szCs w:val="36"/>
-        </w:rPr>
-        <w:t>lj</w:t>
-      </w:r>
-      <w:proofErr w:type="spellEnd"/>
+        <w:t>v_ l</w:t>
+      </w:r>
+      <w:r>
+        <w:rPr>
+          <w:rFonts w:ascii="Preeti" w:hAnsi="Preeti"/>
+          <w:sz w:val="36"/>
+          <w:szCs w:val="36"/>
+        </w:rPr>
+        <w:t>a</w:t>
+      </w:r>
       <w:r>
         <w:rPr>
           <w:rFonts w:ascii="Preeti" w:hAnsi="Preeti"/>
@@ -5587,7 +5657,23 @@
           <w:sz w:val="36"/>
           <w:szCs w:val="36"/>
         </w:rPr>
-        <w:t>flysf</w:t>
+        <w:t>fy</w:t>
+      </w:r>
+      <w:r>
+        <w:rPr>
+          <w:rFonts w:ascii="Preeti" w:hAnsi="Preeti"/>
+          <w:sz w:val="36"/>
+          <w:szCs w:val="36"/>
+        </w:rPr>
+        <w:t>L</w:t>
+      </w:r>
+      <w:r>
+        <w:rPr>
+          <w:rFonts w:ascii="Preeti" w:hAnsi="Preeti"/>
+          <w:sz w:val="36"/>
+          <w:szCs w:val="36"/>
+        </w:rPr>
+        <w:t>sf</w:t>
       </w:r>
       <w:proofErr w:type="spellEnd"/>
       <w:proofErr w:type="gramEnd"/>
@@ -5845,7 +5931,7 @@
           <w:sz w:val="36"/>
           <w:szCs w:val="36"/>
         </w:rPr>
-        <w:t xml:space="preserve"> c+ª\</w:t>
+        <w:t xml:space="preserve"> cª\</w:t>
       </w:r>
       <w:proofErr w:type="gramStart"/>
       <w:r>
@@ -6547,6 +6633,7 @@
         <w:t xml:space="preserve">*= </w:t>
       </w:r>
       <w:proofErr w:type="spellStart"/>
+      <w:proofErr w:type="gramStart"/>
       <w:r>
         <w:rPr>
           <w:rFonts w:ascii="Preeti" w:hAnsi="Preeti"/>
@@ -6566,8 +6653,72 @@
           <w:sz w:val="36"/>
           <w:szCs w:val="36"/>
         </w:rPr>
+        <w:t xml:space="preserve"> :</w:t>
+      </w:r>
+      <w:proofErr w:type="spellStart"/>
+      <w:r>
+        <w:rPr>
+          <w:rFonts w:ascii="Preeti" w:hAnsi="Preeti"/>
+          <w:b/>
+          <w:bCs/>
+          <w:sz w:val="36"/>
+          <w:szCs w:val="36"/>
+        </w:rPr>
+        <w:t>q</w:t>
+      </w:r>
+      <w:r>
+        <w:rPr>
+          <w:rFonts w:ascii="Preeti" w:hAnsi="Preeti"/>
+          <w:b/>
+          <w:bCs/>
+          <w:sz w:val="36"/>
+          <w:szCs w:val="36"/>
+        </w:rPr>
+        <w:t>L</w:t>
+      </w:r>
+      <w:r>
+        <w:rPr>
+          <w:rFonts w:ascii="Preeti" w:hAnsi="Preeti"/>
+          <w:b/>
+          <w:bCs/>
+          <w:sz w:val="36"/>
+          <w:szCs w:val="36"/>
+        </w:rPr>
+        <w:t>ln</w:t>
+      </w:r>
+      <w:proofErr w:type="spellEnd"/>
+      <w:r>
+        <w:rPr>
+          <w:rFonts w:ascii="Preeti" w:hAnsi="Preeti"/>
+          <w:b/>
+          <w:bCs/>
+          <w:sz w:val="36"/>
+          <w:szCs w:val="36"/>
+        </w:rPr>
+        <w:t>ª</w:t>
+      </w:r>
+      <w:proofErr w:type="gramEnd"/>
+      <w:r>
+        <w:rPr>
+          <w:rFonts w:ascii="Preeti" w:hAnsi="Preeti"/>
+          <w:b/>
+          <w:bCs/>
+          <w:sz w:val="36"/>
+          <w:szCs w:val="36"/>
+        </w:rPr>
+        <w:t>\u</w:t>
+      </w:r>
+      <w:r>
+        <w:rPr>
+          <w:rFonts w:ascii="Preeti" w:hAnsi="Preeti"/>
+          <w:b/>
+          <w:bCs/>
+          <w:sz w:val="36"/>
+          <w:szCs w:val="36"/>
+        </w:rPr>
         <w:t xml:space="preserve"> </w:t>
       </w:r>
+      <w:proofErr w:type="spellStart"/>
       <w:proofErr w:type="gramStart"/>
       <w:r>
         <w:rPr>
@@ -6577,7 +6728,40 @@
           <w:sz w:val="36"/>
           <w:szCs w:val="36"/>
         </w:rPr>
-        <w:t>l:qlnË</w:t>
+        <w:t>zAbnfO</w:t>
+      </w:r>
+      <w:proofErr w:type="spellEnd"/>
+      <w:r>
+        <w:rPr>
+          <w:rFonts w:ascii="Preeti" w:hAnsi="Preeti"/>
+          <w:b/>
+          <w:bCs/>
+          <w:sz w:val="36"/>
+          <w:szCs w:val="36"/>
+        </w:rPr>
+        <w:t xml:space="preserve">{ </w:t>
+      </w:r>
+      <w:proofErr w:type="spellStart"/>
+      <w:r>
+        <w:rPr>
+          <w:rFonts w:ascii="Preeti" w:hAnsi="Preeti"/>
+          <w:b/>
+          <w:bCs/>
+          <w:sz w:val="36"/>
+          <w:szCs w:val="36"/>
+        </w:rPr>
+        <w:t>k'ln</w:t>
+      </w:r>
+      <w:proofErr w:type="spellEnd"/>
+      <w:r>
+        <w:rPr>
+          <w:rFonts w:ascii="Preeti" w:hAnsi="Preeti"/>
+          <w:b/>
+          <w:bCs/>
+          <w:sz w:val="36"/>
+          <w:szCs w:val="36"/>
+        </w:rPr>
+        <w:t>ª</w:t>
       </w:r>
       <w:proofErr w:type="gramEnd"/>
       <w:r>
@@ -6588,44 +6772,8 @@
           <w:sz w:val="36"/>
           <w:szCs w:val="36"/>
         </w:rPr>
-        <w:t xml:space="preserve"> </w:t>
-      </w:r>
-      <w:proofErr w:type="spellStart"/>
-      <w:proofErr w:type="gramStart"/>
-      <w:r>
-        <w:rPr>
-          <w:rFonts w:ascii="Preeti" w:hAnsi="Preeti"/>
-          <w:b/>
-          <w:bCs/>
-          <w:sz w:val="36"/>
-          <w:szCs w:val="36"/>
-        </w:rPr>
-        <w:t>zAbnfO</w:t>
-      </w:r>
-      <w:proofErr w:type="spellEnd"/>
-      <w:r>
-        <w:rPr>
-          <w:rFonts w:ascii="Preeti" w:hAnsi="Preeti"/>
-          <w:b/>
-          <w:bCs/>
-          <w:sz w:val="36"/>
-          <w:szCs w:val="36"/>
-        </w:rPr>
-        <w:t xml:space="preserve">{ </w:t>
-      </w:r>
-      <w:proofErr w:type="spellStart"/>
-      <w:r>
-        <w:rPr>
-          <w:rFonts w:ascii="Preeti" w:hAnsi="Preeti"/>
-          <w:b/>
-          <w:bCs/>
-          <w:sz w:val="36"/>
-          <w:szCs w:val="36"/>
-        </w:rPr>
-        <w:t>k'lnË</w:t>
-      </w:r>
-      <w:proofErr w:type="spellEnd"/>
-      <w:proofErr w:type="gramEnd"/>
+        <w:t>\u</w:t>
+      </w:r>
       <w:r>
         <w:rPr>
           <w:rFonts w:ascii="Preeti" w:hAnsi="Preeti"/>
@@ -6964,7 +7112,27 @@
           <w:sz w:val="36"/>
           <w:szCs w:val="36"/>
         </w:rPr>
-        <w:t>PsargnfO</w:t>
+        <w:t>Ps</w:t>
+      </w:r>
+      <w:r>
+        <w:rPr>
+          <w:rFonts w:ascii="Preeti" w:hAnsi="Preeti"/>
+          <w:b/>
+          <w:bCs/>
+          <w:sz w:val="36"/>
+          <w:szCs w:val="36"/>
+        </w:rPr>
+        <w:t>j</w:t>
+      </w:r>
+      <w:r>
+        <w:rPr>
+          <w:rFonts w:ascii="Preeti" w:hAnsi="Preeti"/>
+          <w:b/>
+          <w:bCs/>
+          <w:sz w:val="36"/>
+          <w:szCs w:val="36"/>
+        </w:rPr>
+        <w:t>rgnfO</w:t>
       </w:r>
       <w:proofErr w:type="spellEnd"/>
       <w:r>
@@ -7414,16 +7582,16 @@
           <w:noProof/>
         </w:rPr>
         <w:drawing>
-          <wp:anchor distT="0" distB="0" distL="114300" distR="114300" simplePos="0" relativeHeight="251670016" behindDoc="1" locked="0" layoutInCell="1" allowOverlap="1" wp14:anchorId="55E9834E" wp14:editId="7A5F1A21">
+          <wp:anchor distT="0" distB="0" distL="114300" distR="114300" simplePos="0" relativeHeight="251670016" behindDoc="1" locked="0" layoutInCell="1" allowOverlap="1" wp14:anchorId="55E9834E" wp14:editId="357E91CB">
             <wp:simplePos x="0" y="0"/>
             <wp:positionH relativeFrom="column">
-              <wp:posOffset>2038350</wp:posOffset>
+              <wp:posOffset>2295773</wp:posOffset>
             </wp:positionH>
             <wp:positionV relativeFrom="paragraph">
-              <wp:posOffset>113030</wp:posOffset>
+              <wp:posOffset>109303</wp:posOffset>
             </wp:positionV>
-            <wp:extent cx="1076325" cy="985520"/>
-            <wp:effectExtent l="0" t="0" r="9525" b="5080"/>
+            <wp:extent cx="548640" cy="985287"/>
+            <wp:effectExtent l="0" t="0" r="3810" b="5715"/>
             <wp:wrapNone/>
             <wp:docPr id="2" name="Picture 2" descr="Cellphone Drawing Easy"/>
             <wp:cNvGraphicFramePr>
@@ -7438,7 +7606,7 @@
                       <a:picLocks noChangeAspect="1" noChangeArrowheads="1"/>
                     </pic:cNvPicPr>
                   </pic:nvPicPr>
-                  <pic:blipFill>
+                  <pic:blipFill rotWithShape="1">
                     <a:blip r:embed="rId5" cstate="print">
                       <a:extLst>
                         <a:ext uri="{28A0092B-C50C-407E-A947-70E740481C1C}">
@@ -7446,7 +7614,7 @@
                         </a:ext>
                       </a:extLst>
                     </a:blip>
-                    <a:srcRect/>
+                    <a:srcRect l="23640" r="25375"/>
                     <a:stretch>
                       <a:fillRect/>
                     </a:stretch>
@@ -7454,7 +7622,7 @@
                   <pic:spPr bwMode="auto">
                     <a:xfrm>
                       <a:off x="0" y="0"/>
-                      <a:ext cx="1076325" cy="985520"/>
+                      <a:ext cx="548770" cy="985520"/>
                     </a:xfrm>
                     <a:prstGeom prst="rect">
                       <a:avLst/>
@@ -7463,6 +7631,11 @@
                     <a:ln>
                       <a:noFill/>
                     </a:ln>
+                    <a:extLst>
+                      <a:ext uri="{53640926-AAD7-44D8-BBD7-CCE9431645EC}">
+                        <a14:shadowObscured xmlns:a14="http://schemas.microsoft.com/office/drawing/2010/main"/>
+                      </a:ext>
+                    </a:extLst>
                   </pic:spPr>
                 </pic:pic>
               </a:graphicData>
@@ -7563,6 +7736,7 @@
           <w:tab w:val="left" w:pos="2430"/>
           <w:tab w:val="left" w:pos="5850"/>
         </w:tabs>
+        <w:jc w:val="center"/>
         <w:rPr>
           <w:rFonts w:ascii="Preeti" w:hAnsi="Preeti"/>
           <w:sz w:val="36"/>
@@ -7616,6 +7790,78 @@
       </w:pPr>
       <w:r>
         <w:rPr>
+          <w:noProof/>
+        </w:rPr>
+        <w:drawing>
+          <wp:anchor distT="0" distB="0" distL="114300" distR="114300" simplePos="0" relativeHeight="251663360" behindDoc="0" locked="0" layoutInCell="1" allowOverlap="1" wp14:anchorId="62449BD0" wp14:editId="7249E055">
+            <wp:simplePos x="0" y="0"/>
+            <wp:positionH relativeFrom="column">
+              <wp:posOffset>2995339</wp:posOffset>
+            </wp:positionH>
+            <wp:positionV relativeFrom="paragraph">
+              <wp:posOffset>357966</wp:posOffset>
+            </wp:positionV>
+            <wp:extent cx="1276591" cy="1268946"/>
+            <wp:effectExtent l="0" t="0" r="0" b="7620"/>
+            <wp:wrapNone/>
+            <wp:docPr id="350895826" name="Picture 3" descr="Black and White Moon Symbol Clip Art Free PNG Image｜Illustoon"/>
+            <wp:cNvGraphicFramePr>
+              <a:graphicFrameLocks xmlns:a="http://schemas.openxmlformats.org/drawingml/2006/main" noChangeAspect="1"/>
+            </wp:cNvGraphicFramePr>
+            <a:graphic xmlns:a="http://schemas.openxmlformats.org/drawingml/2006/main">
+              <a:graphicData uri="http://schemas.openxmlformats.org/drawingml/2006/picture">
+                <pic:pic xmlns:pic="http://schemas.openxmlformats.org/drawingml/2006/picture">
+                  <pic:nvPicPr>
+                    <pic:cNvPr id="0" name="Picture 1" descr="Black and White Moon Symbol Clip Art Free PNG Image｜Illustoon"/>
+                    <pic:cNvPicPr>
+                      <a:picLocks noChangeAspect="1" noChangeArrowheads="1"/>
+                    </pic:cNvPicPr>
+                  </pic:nvPicPr>
+                  <pic:blipFill rotWithShape="1">
+                    <a:blip r:embed="rId8" cstate="print">
+                      <a:extLst>
+                        <a:ext uri="{28A0092B-C50C-407E-A947-70E740481C1C}">
+                          <a14:useLocalDpi xmlns:a14="http://schemas.microsoft.com/office/drawing/2010/main" val="0"/>
+                        </a:ext>
+                      </a:extLst>
+                    </a:blip>
+                    <a:srcRect l="9567" t="10934" r="10230" b="9342"/>
+                    <a:stretch>
+                      <a:fillRect/>
+                    </a:stretch>
+                  </pic:blipFill>
+                  <pic:spPr bwMode="auto">
+                    <a:xfrm>
+                      <a:off x="0" y="0"/>
+                      <a:ext cx="1276591" cy="1268946"/>
+                    </a:xfrm>
+                    <a:prstGeom prst="rect">
+                      <a:avLst/>
+                    </a:prstGeom>
+                    <a:noFill/>
+                    <a:ln>
+                      <a:noFill/>
+                    </a:ln>
+                    <a:extLst>
+                      <a:ext uri="{53640926-AAD7-44D8-BBD7-CCE9431645EC}">
+                        <a14:shadowObscured xmlns:a14="http://schemas.microsoft.com/office/drawing/2010/main"/>
+                      </a:ext>
+                    </a:extLst>
+                  </pic:spPr>
+                </pic:pic>
+              </a:graphicData>
+            </a:graphic>
+            <wp14:sizeRelH relativeFrom="margin">
+              <wp14:pctWidth>0</wp14:pctWidth>
+            </wp14:sizeRelH>
+            <wp14:sizeRelV relativeFrom="margin">
+              <wp14:pctHeight>0</wp14:pctHeight>
+            </wp14:sizeRelV>
+          </wp:anchor>
+        </w:drawing>
+      </w:r>
+      <w:r>
+        <w:rPr>
           <w:rFonts w:ascii="Preeti" w:hAnsi="Preeti"/>
           <w:sz w:val="36"/>
           <w:szCs w:val="36"/>
@@ -7668,80 +7914,11 @@
           <w:szCs w:val="36"/>
         </w:rPr>
       </w:pPr>
-      <w:r>
-        <w:rPr>
-          <w:noProof/>
-        </w:rPr>
-        <w:drawing>
-          <wp:anchor distT="0" distB="0" distL="114300" distR="114300" simplePos="0" relativeHeight="251674112" behindDoc="1" locked="0" layoutInCell="1" allowOverlap="1" wp14:anchorId="4A05966B" wp14:editId="53686AC0">
-            <wp:simplePos x="0" y="0"/>
-            <wp:positionH relativeFrom="column">
-              <wp:posOffset>2667635</wp:posOffset>
-            </wp:positionH>
-            <wp:positionV relativeFrom="paragraph">
-              <wp:posOffset>168275</wp:posOffset>
-            </wp:positionV>
-            <wp:extent cx="1285875" cy="857885"/>
-            <wp:effectExtent l="0" t="0" r="9525" b="0"/>
-            <wp:wrapNone/>
-            <wp:docPr id="6" name="Picture 6" descr="Moon Drawing Line Stock Illustrations – 28,377 Moon Drawing Line Stock  Illustrations, Vectors &amp; Clipart - Dreamstime"/>
-            <wp:cNvGraphicFramePr>
-              <a:graphicFrameLocks xmlns:a="http://schemas.openxmlformats.org/drawingml/2006/main" noChangeAspect="1"/>
-            </wp:cNvGraphicFramePr>
-            <a:graphic xmlns:a="http://schemas.openxmlformats.org/drawingml/2006/main">
-              <a:graphicData uri="http://schemas.openxmlformats.org/drawingml/2006/picture">
-                <pic:pic xmlns:pic="http://schemas.openxmlformats.org/drawingml/2006/picture">
-                  <pic:nvPicPr>
-                    <pic:cNvPr id="0" name="Picture 11" descr="Moon Drawing Line Stock Illustrations – 28,377 Moon Drawing Line Stock  Illustrations, Vectors &amp; Clipart - Dreamstime"/>
-                    <pic:cNvPicPr>
-                      <a:picLocks noChangeAspect="1" noChangeArrowheads="1"/>
-                    </pic:cNvPicPr>
-                  </pic:nvPicPr>
-                  <pic:blipFill>
-                    <a:blip r:embed="rId8" cstate="print">
-                      <a:extLst>
-                        <a:ext uri="{28A0092B-C50C-407E-A947-70E740481C1C}">
-                          <a14:useLocalDpi xmlns:a14="http://schemas.microsoft.com/office/drawing/2010/main" val="0"/>
-                        </a:ext>
-                      </a:extLst>
-                    </a:blip>
-                    <a:srcRect/>
-                    <a:stretch>
-                      <a:fillRect/>
-                    </a:stretch>
-                  </pic:blipFill>
-                  <pic:spPr bwMode="auto">
-                    <a:xfrm>
-                      <a:off x="0" y="0"/>
-                      <a:ext cx="1285875" cy="857885"/>
-                    </a:xfrm>
-                    <a:prstGeom prst="rect">
-                      <a:avLst/>
-                    </a:prstGeom>
-                    <a:noFill/>
-                    <a:ln>
-                      <a:noFill/>
-                    </a:ln>
-                  </pic:spPr>
-                </pic:pic>
-              </a:graphicData>
-            </a:graphic>
-            <wp14:sizeRelH relativeFrom="page">
-              <wp14:pctWidth>0</wp14:pctWidth>
-            </wp14:sizeRelH>
-            <wp14:sizeRelV relativeFrom="page">
-              <wp14:pctHeight>0</wp14:pctHeight>
-            </wp14:sizeRelV>
-          </wp:anchor>
-        </w:drawing>
-      </w:r>
     </w:p>
     <w:p>
       <w:pPr>
         <w:tabs>
-          <w:tab w:val="left" w:pos="720"/>
-          <w:tab w:val="left" w:pos="2430"/>
-          <w:tab w:val="left" w:pos="5850"/>
+          <w:tab w:val="left" w:pos="3506"/>
         </w:tabs>
         <w:rPr>
           <w:noProof/>
@@ -7752,7 +7929,7 @@
           <w:noProof/>
         </w:rPr>
         <w:drawing>
-          <wp:anchor distT="0" distB="0" distL="114300" distR="114300" simplePos="0" relativeHeight="251672064" behindDoc="0" locked="0" layoutInCell="1" allowOverlap="1" wp14:anchorId="67D42675" wp14:editId="7EEAB513">
+          <wp:anchor distT="0" distB="0" distL="114300" distR="114300" simplePos="0" relativeHeight="251651072" behindDoc="0" locked="0" layoutInCell="1" allowOverlap="1" wp14:anchorId="67D42675" wp14:editId="603AC403">
             <wp:simplePos x="0" y="0"/>
             <wp:positionH relativeFrom="column">
               <wp:posOffset>0</wp:posOffset>
@@ -7814,6 +7991,12 @@
           </wp:anchor>
         </w:drawing>
       </w:r>
+      <w:r>
+        <w:rPr>
+          <w:noProof/>
+        </w:rPr>
+        <w:tab/>
+      </w:r>
     </w:p>
     <w:p>
       <w:pPr>
@@ -7869,7 +8052,7 @@
           <w:noProof/>
         </w:rPr>
         <w:drawing>
-          <wp:anchor distT="0" distB="0" distL="114300" distR="114300" simplePos="0" relativeHeight="251676160" behindDoc="0" locked="0" layoutInCell="1" allowOverlap="1" wp14:anchorId="7AB94A53" wp14:editId="316538BB">
+          <wp:anchor distT="0" distB="0" distL="114300" distR="114300" simplePos="0" relativeHeight="251654144" behindDoc="0" locked="0" layoutInCell="1" allowOverlap="1" wp14:anchorId="7AB94A53" wp14:editId="316538BB">
             <wp:simplePos x="0" y="0"/>
             <wp:positionH relativeFrom="column">
               <wp:posOffset>-1297940</wp:posOffset>

</xml_diff>